<commit_message>
Remove in-document admissions that these files are samples
Word files no longer say RailClear is fictional, mention an exhibit
mill or page budget, or label clients as samples. Catalog copy used
for intake answers is in-universe as well.

Co-authored-by: Murphy601 <Murphy601@users.noreply.github.com>
</commit_message>
<xml_diff>
--- a/documents/01-oakridge-inventory-api-requirements.docx
+++ b/documents/01-oakridge-inventory-api-requirements.docx
@@ -11196,7 +11196,7 @@
         <w:pStyle w:val="Heading1"/>
       </w:pPr>
       <w:r>
-        <w:t>Working remainder for OAK-REQ-2019-014</w:t>
+        <w:t>Open work after November 18, 2019</w:t>
       </w:r>
     </w:p>
     <w:p>
@@ -11210,7 +11210,7 @@
           <w:color w:val="222222"/>
           <w:sz w:val="24"/>
         </w:rPr>
-        <w:t>The front of Oakridge Inventory Position API v1 Requirements is the document. This remainder is the leftover a colleague still trips on: named people, named boxes, named tickets, and the work I still owe after November 18, 2019. It is not a second log and it is not a stack of exhibits with the same stub. If a paragraph fights the decision in the front, strike the paragraph.</w:t>
+        <w:t>What follows is leftover work from Oakridge Inventory Position API v1 Requirements: named people, named boxes, named tickets, and the items I still owe. If a paragraph fights the decision in the front of OAK-REQ-2019-014, strike the paragraph.</w:t>
       </w:r>
     </w:p>
     <w:p>
@@ -11364,7 +11364,7 @@
           <w:color w:val="222222"/>
           <w:sz w:val="24"/>
         </w:rPr>
-        <w:t>I will not put secret skew that looks like 'no work' on a wiki that drifts. OAK-4412 and this file are the record. If Priya Nair needs a diagram, they get a permalink, not a photo of a whiteboard. forgenet-ro-01.oak.internal stays out of the diagram title. If a new engineer asks where the leftover lives, I point here. I do not point at a Slack pin from November 18, 2019. Client Oakridge.</w:t>
+        <w:t>I will not put secret skew that looks like 'no work' on a wiki that drifts. OAK-4412 and this file are the record. If Priya Nair needs a diagram, they get a permalink, not a photo of a whiteboard. forgenet-ro-01.oak.internal stays out of the diagram title. If a new engineer asks where the leftover lives, I point here. I do not point at a Slack pin from November 18, 2019.</w:t>
       </w:r>
     </w:p>
     <w:p>
@@ -13708,7 +13708,7 @@
           <w:color w:val="222222"/>
           <w:sz w:val="24"/>
         </w:rPr>
-        <w:t>People who were absent still get a usable remainder, not a transcript. Aman Kumar gets the decision, the refuse, and the date. They do not get a reconstruction of who raised their voice. If they object, they object on OAK-MTG-2019-044. Client Oakridge. Author Aman Kumar.</w:t>
+        <w:t>People who were absent still get a usable remainder, not a transcript. Aman Kumar gets the decision, the refuse, and the date. They do not get a reconstruction of who raised their voice. If they object, they object on OAK-MTG-2019-044.</w:t>
       </w:r>
     </w:p>
     <w:p>
@@ -14753,7 +14753,7 @@
           <w:color w:val="222222"/>
           <w:sz w:val="24"/>
         </w:rPr>
-        <w:t>If you are implementing, keep the rejected alternative dead. If you are on-call, start read-only. If you are Priya Nair, the ask is unchanged: pick the path in the main body or send it back with a named objection. Sample I would still defend: 2786 rows, 32 minutes, freeze respected. Strike this remainder if it ever fights the decision callout. Author Aman Kumar. Client Oakridge.</w:t>
+        <w:t>If you are implementing, keep the rejected alternative dead. If you are on-call, start read-only. If you are Priya Nair, the ask is unchanged: pick the path in the main body or send it back with a named objection. Sample I would still defend: 2786 rows, 32 minutes, freeze respected. Strike this section if it ever fights the decision callout.</w:t>
       </w:r>
     </w:p>
     <w:p>
@@ -14767,7 +14767,7 @@
           <w:color w:val="222222"/>
           <w:sz w:val="24"/>
         </w:rPr>
-        <w:t>This heading is the reopen rule, not a promise that nothing follows. If we still need words after the bank, they are named leftovers, not another copy of the same stub. owner as a team name instead of a person is done as a heading when Priya Nair closes OAK-SOP-2020-011 or writes a new date.</w:t>
+        <w:t>This heading is the reopen rule. owner as a team name instead of a person is done when Priya Nair closes OAK-SOP-2020-011 or writes a new date.</w:t>
       </w:r>
     </w:p>
     <w:p>

</xml_diff>